<commit_message>
add header to official_mom_header.docx
</commit_message>
<xml_diff>
--- a/data/templates/official_mom_header.docx
+++ b/data/templates/official_mom_header.docx
@@ -49,7 +49,7 @@
                     <pic:cNvPicPr/>
                   </pic:nvPicPr>
                   <pic:blipFill rotWithShape="1">
-                    <a:blip r:embed="rId8" cstate="print">
+                    <a:blip r:embed="rId7" cstate="print">
                       <a:extLst>
                         <a:ext uri="{28A0092B-C50C-407E-A947-70E740481C1C}">
                           <a14:useLocalDpi xmlns:a14="http://schemas.microsoft.com/office/drawing/2010/main" val="0"/>
@@ -173,19 +173,7 @@
           <w:szCs w:val="24"/>
           <w:lang w:eastAsia="en-GB"/>
         </w:rPr>
-        <w:t>Data Science</w:t>
-      </w:r>
-      <w:r>
-        <w:rPr>
-          <w:rFonts w:asciiTheme="minorHAnsi" w:eastAsia="Times New Roman" w:hAnsiTheme="minorHAnsi" w:cstheme="minorHAnsi"/>
-          <w:b/>
-          <w:bCs/>
-          <w:color w:val="000000" w:themeColor="text1"/>
-          <w:sz w:val="24"/>
-          <w:szCs w:val="24"/>
-          <w:lang w:eastAsia="en-GB"/>
-        </w:rPr>
-        <w:t xml:space="preserve"> Program</w:t>
+        <w:t>DEPARTMENT OF DATA SCIENCE AND COMPUTER ENGINEERING</w:t>
       </w:r>
       <w:r>
         <w:rPr>
@@ -198,7 +186,6 @@
           <w:lang w:eastAsia="en-GB"/>
         </w:rPr>
         <w:br/>
-        <w:t>FACULTY OF COMPUTER ENGINEERING</w:t>
       </w:r>
       <w:r>
         <w:rPr>
@@ -210,7 +197,43 @@
           <w:szCs w:val="24"/>
           <w:lang w:eastAsia="en-GB"/>
         </w:rPr>
-        <w:t xml:space="preserve"> AND DATA SCIENCE</w:t>
+        <w:t xml:space="preserve">FACULTY OF COMPUTER </w:t>
+      </w:r>
+      <w:r>
+        <w:rPr>
+          <w:rFonts w:asciiTheme="minorHAnsi" w:eastAsia="Times New Roman" w:hAnsiTheme="minorHAnsi" w:cstheme="minorHAnsi"/>
+          <w:b/>
+          <w:bCs/>
+          <w:color w:val="000000" w:themeColor="text1"/>
+          <w:sz w:val="24"/>
+          <w:szCs w:val="24"/>
+          <w:lang w:eastAsia="en-GB"/>
+        </w:rPr>
+        <w:t>SCIENCE</w:t>
+      </w:r>
+      <w:r>
+        <w:rPr>
+          <w:rFonts w:asciiTheme="minorHAnsi" w:eastAsia="Times New Roman" w:hAnsiTheme="minorHAnsi" w:cstheme="minorHAnsi"/>
+          <w:b/>
+          <w:bCs/>
+          <w:color w:val="000000" w:themeColor="text1"/>
+          <w:sz w:val="24"/>
+          <w:szCs w:val="24"/>
+          <w:lang w:eastAsia="en-GB"/>
+        </w:rPr>
+        <w:t xml:space="preserve"> AND </w:t>
+      </w:r>
+      <w:r>
+        <w:rPr>
+          <w:rFonts w:asciiTheme="minorHAnsi" w:eastAsia="Times New Roman" w:hAnsiTheme="minorHAnsi" w:cstheme="minorHAnsi"/>
+          <w:b/>
+          <w:bCs/>
+          <w:color w:val="000000" w:themeColor="text1"/>
+          <w:sz w:val="24"/>
+          <w:szCs w:val="24"/>
+          <w:lang w:eastAsia="en-GB"/>
+        </w:rPr>
+        <w:t>ENGINEERING</w:t>
       </w:r>
     </w:p>
     <w:p>
@@ -237,165 +260,6 @@
           <w:lang w:eastAsia="en-GB"/>
         </w:rPr>
         <w:t>GIK INSTITUTE OF ENGINEERING SCIENCES AND TECHNOLOGY</w:t>
-      </w:r>
-    </w:p>
-    <w:p>
-      <w:pPr>
-        <w:rPr>
-          <w:rFonts w:asciiTheme="minorHAnsi" w:hAnsiTheme="minorHAnsi" w:cstheme="minorHAnsi"/>
-          <w:color w:val="000000" w:themeColor="text1"/>
-          <w:sz w:val="24"/>
-          <w:szCs w:val="24"/>
-        </w:rPr>
-      </w:pPr>
-    </w:p>
-    <w:p>
-      <w:pPr>
-        <w:spacing w:before="120" w:after="60"/>
-        <w:jc w:val="center"/>
-        <w:rPr>
-          <w:rFonts w:asciiTheme="minorHAnsi" w:hAnsiTheme="minorHAnsi" w:cstheme="minorHAnsi"/>
-          <w:b/>
-          <w:bCs/>
-          <w:color w:val="000000" w:themeColor="text1"/>
-          <w:sz w:val="24"/>
-          <w:szCs w:val="24"/>
-          <w:u w:val="single"/>
-        </w:rPr>
-      </w:pPr>
-      <w:r>
-        <w:rPr>
-          <w:rFonts w:asciiTheme="minorHAnsi" w:hAnsiTheme="minorHAnsi" w:cstheme="minorHAnsi"/>
-          <w:b/>
-          <w:bCs/>
-          <w:color w:val="000000" w:themeColor="text1"/>
-          <w:sz w:val="24"/>
-          <w:szCs w:val="24"/>
-          <w:u w:val="single"/>
-        </w:rPr>
-        <w:t>Minutes of the Curriculum Committee Meeting Curriculum Review and Revision (2025–26)</w:t>
-      </w:r>
-    </w:p>
-    <w:p>
-      <w:pPr>
-        <w:spacing w:before="120" w:after="120"/>
-        <w:jc w:val="center"/>
-        <w:rPr>
-          <w:rFonts w:asciiTheme="minorHAnsi" w:hAnsiTheme="minorHAnsi" w:cstheme="minorHAnsi"/>
-          <w:b/>
-          <w:color w:val="000000" w:themeColor="text1"/>
-          <w:sz w:val="24"/>
-          <w:szCs w:val="24"/>
-          <w:u w:val="single"/>
-        </w:rPr>
-      </w:pPr>
-      <w:r>
-        <w:rPr>
-          <w:rFonts w:asciiTheme="minorHAnsi" w:hAnsiTheme="minorHAnsi" w:cstheme="minorHAnsi"/>
-          <w:b/>
-          <w:bCs/>
-          <w:color w:val="000000" w:themeColor="text1"/>
-          <w:sz w:val="24"/>
-          <w:szCs w:val="24"/>
-          <w:u w:val="single"/>
-        </w:rPr>
-        <w:t xml:space="preserve">HELD ON </w:t>
-      </w:r>
-      <w:r>
-        <w:rPr>
-          <w:rFonts w:asciiTheme="minorHAnsi" w:hAnsiTheme="minorHAnsi" w:cstheme="minorHAnsi"/>
-          <w:b/>
-          <w:bCs/>
-          <w:color w:val="000000" w:themeColor="text1"/>
-          <w:sz w:val="24"/>
-          <w:szCs w:val="24"/>
-          <w:u w:val="single"/>
-        </w:rPr>
-        <w:t>May</w:t>
-      </w:r>
-      <w:r>
-        <w:rPr>
-          <w:rFonts w:asciiTheme="minorHAnsi" w:hAnsiTheme="minorHAnsi" w:cstheme="minorHAnsi"/>
-          <w:b/>
-          <w:bCs/>
-          <w:color w:val="000000" w:themeColor="text1"/>
-          <w:sz w:val="24"/>
-          <w:szCs w:val="24"/>
-          <w:u w:val="single"/>
-        </w:rPr>
-        <w:t xml:space="preserve"> </w:t>
-      </w:r>
-      <w:r>
-        <w:rPr>
-          <w:rFonts w:asciiTheme="minorHAnsi" w:hAnsiTheme="minorHAnsi" w:cstheme="minorHAnsi"/>
-          <w:b/>
-          <w:bCs/>
-          <w:color w:val="000000" w:themeColor="text1"/>
-          <w:sz w:val="24"/>
-          <w:szCs w:val="24"/>
-          <w:u w:val="single"/>
-        </w:rPr>
-        <w:t>5</w:t>
-      </w:r>
-      <w:r>
-        <w:rPr>
-          <w:rFonts w:asciiTheme="minorHAnsi" w:hAnsiTheme="minorHAnsi" w:cstheme="minorHAnsi"/>
-          <w:b/>
-          <w:bCs/>
-          <w:color w:val="000000" w:themeColor="text1"/>
-          <w:sz w:val="24"/>
-          <w:szCs w:val="24"/>
-          <w:u w:val="single"/>
-        </w:rPr>
-        <w:t>, 2026, AT 1</w:t>
-      </w:r>
-      <w:r>
-        <w:rPr>
-          <w:rFonts w:asciiTheme="minorHAnsi" w:hAnsiTheme="minorHAnsi" w:cstheme="minorHAnsi"/>
-          <w:b/>
-          <w:bCs/>
-          <w:color w:val="000000" w:themeColor="text1"/>
-          <w:sz w:val="24"/>
-          <w:szCs w:val="24"/>
-          <w:u w:val="single"/>
-        </w:rPr>
-        <w:t>1</w:t>
-      </w:r>
-      <w:r>
-        <w:rPr>
-          <w:rFonts w:asciiTheme="minorHAnsi" w:hAnsiTheme="minorHAnsi" w:cstheme="minorHAnsi"/>
-          <w:b/>
-          <w:bCs/>
-          <w:color w:val="000000" w:themeColor="text1"/>
-          <w:sz w:val="24"/>
-          <w:szCs w:val="24"/>
-          <w:u w:val="single"/>
-        </w:rPr>
-        <w:t>:</w:t>
-      </w:r>
-      <w:r>
-        <w:rPr>
-          <w:rFonts w:asciiTheme="minorHAnsi" w:hAnsiTheme="minorHAnsi" w:cstheme="minorHAnsi"/>
-          <w:b/>
-          <w:bCs/>
-          <w:color w:val="000000" w:themeColor="text1"/>
-          <w:sz w:val="24"/>
-          <w:szCs w:val="24"/>
-          <w:u w:val="single"/>
-        </w:rPr>
-        <w:t>0</w:t>
-      </w:r>
-      <w:r>
-        <w:rPr>
-          <w:rFonts w:asciiTheme="minorHAnsi" w:hAnsiTheme="minorHAnsi" w:cstheme="minorHAnsi"/>
-          <w:b/>
-          <w:bCs/>
-          <w:color w:val="000000" w:themeColor="text1"/>
-          <w:sz w:val="24"/>
-          <w:szCs w:val="24"/>
-          <w:u w:val="single"/>
-        </w:rPr>
-        <w:t>0 PM</w:t>
       </w:r>
     </w:p>
     <w:p>
@@ -454,10 +318,6 @@
     </w:p>
   </w:footnote>
 </w:footnotes>
-</file>
-
-<file path=word/numbering.xml><?xml version="1.0" encoding="utf-8"?>
-<w:numbering xmlns:wpc="http://schemas.microsoft.com/office/word/2010/wordprocessingCanvas" xmlns:cx="http://schemas.microsoft.com/office/drawing/2014/chartex" xmlns:cx1="http://schemas.microsoft.com/office/drawing/2015/9/8/chartex" xmlns:cx2="http://schemas.microsoft.com/office/drawing/2015/10/21/chartex" xmlns:cx3="http://schemas.microsoft.com/office/drawing/2016/5/9/chartex" xmlns:cx4="http://schemas.microsoft.com/office/drawing/2016/5/10/chartex" xmlns:cx5="http://schemas.microsoft.com/office/drawing/2016/5/11/chartex" xmlns:cx6="http://schemas.microsoft.com/office/drawing/2016/5/12/chartex" xmlns:cx7="http://schemas.microsoft.com/office/drawing/2016/5/13/chartex" xmlns:cx8="http://schemas.microsoft.com/office/drawing/2016/5/14/chartex" xmlns:mc="http://schemas.openxmlformats.org/markup-compatibility/2006" xmlns:aink="http://schemas.microsoft.com/office/drawing/2016/ink" xmlns:am3d="http://schemas.microsoft.com/office/drawing/2017/model3d" xmlns:o="urn:schemas-microsoft-com:office:office" xmlns:oel="http://schemas.microsoft.com/office/2019/extlst" xmlns:r="http://schemas.openxmlformats.org/officeDocument/2006/relationships" xmlns:m="http://schemas.openxmlformats.org/officeDocument/2006/math" xmlns:v="urn:schemas-microsoft-com:vml" xmlns:wp14="http://schemas.microsoft.com/office/word/2010/wordprocessingDrawing" xmlns:wp="http://schemas.openxmlformats.org/drawingml/2006/wordprocessingDrawing" xmlns:w10="urn:schemas-microsoft-com:office:word" xmlns:w="http://schemas.openxmlformats.org/wordprocessingml/2006/main" xmlns:w14="http://schemas.microsoft.com/office/word/2010/wordml" xmlns:w15="http://schemas.microsoft.com/office/word/2012/wordml" xmlns:w16cex="http://schemas.microsoft.com/office/word/2018/wordml/cex" xmlns:w16cid="http://schemas.microsoft.com/office/word/2016/wordml/cid" xmlns:w16="http://schemas.microsoft.com/office/word/2018/wordml" xmlns:w16du="http://schemas.microsoft.com/office/word/2023/wordml/word16du" xmlns:w16sdtdh="http://schemas.microsoft.com/office/word/2020/wordml/sdtdatahash" xmlns:w16sdtfl="http://schemas.microsoft.com/office/word/2024/wordml/sdtformatlock" xmlns:w16se="http://schemas.microsoft.com/office/word/2015/wordml/symex" xmlns:wpg="http://schemas.microsoft.com/office/word/2010/wordprocessingGroup" xmlns:wpi="http://schemas.microsoft.com/office/word/2010/wordprocessingInk" xmlns:wne="http://schemas.microsoft.com/office/word/2006/wordml" xmlns:wps="http://schemas.microsoft.com/office/word/2010/wordprocessingShape" mc:Ignorable="w14 w15 w16se w16cid w16 w16cex w16sdtdh w16sdtfl w16du wp14"/>
 </file>
 
 <file path=word/styles.xml><?xml version="1.0" encoding="utf-8"?>

</xml_diff>